<commit_message>
Resolve outstanding author checks; add repository URL
- Single author; the LaTeX author block now takes AUTHOR/AFFILIATION/EMAIL
  from R/51_manuscript_latex.R (name and affiliation still to fill in)
- Madagascar stunting: replaced the unverifiable global-ranking claim with
  the comparison to the 2023 JME global prevalence of 22.3%
- Fieldwork: the released file contains only 2021 interviews (all 650
  clusters, March-July), so the 56 clusters from the suspended 2020 round
  are not included - verified from hv006/hv007 in the PR recode
- Removed the supplementary-file cross-reference for the MI trace plots
- Replaced 'a few hundredths of a percentage point', which reads
  ambiguously, with the explicit figures
- Ethics statement now says only what the survey report documents
- Code availability: https://github.com/valofils/missing-data-methods-madagascar-dhs

No [CONFIRM] items remain in the assembled manuscript.

Co-Authored-By: Claude Opus 5 <noreply@anthropic.com>
</commit_message>
<xml_diff>
--- a/docs/manuscript/manuscript_draft.docx
+++ b/docs/manuscript/manuscript_draft.docx
@@ -56,7 +56,7 @@
         <w:t xml:space="preserve"> </w:t>
       </w:r>
       <w:r>
-        <w:t xml:space="preserve">Outstanding author checks marked in the text: 5. All references still require verification before submission.</w:t>
+        <w:t xml:space="preserve">Outstanding author checks marked in the text: 0. All references still require verification before submission.</w:t>
       </w:r>
     </w:p>
     <w:bookmarkStart w:id="34" w:name="X8a87032e6ec01664aeba3e1c865a530c6c5d5f6"/>
@@ -338,32 +338,13 @@
         <w:t xml:space="preserve"> </w:t>
       </w:r>
       <w:r>
-        <w:t xml:space="preserve">Development Goals [5]. In Madagascar, 40% of children under 5 are stunted, among the highest</w:t>
-      </w:r>
-      <w:r>
-        <w:t xml:space="preserve"> </w:t>
-      </w:r>
-      <w:r>
-        <w:t xml:space="preserve">prevalences in the world</w:t>
-      </w:r>
-      <w:r>
-        <w:t xml:space="preserve"> </w:t>
-      </w:r>
-      <w:r>
-        <w:rPr>
-          <w:b/>
-          <w:bCs/>
-        </w:rPr>
-        <w:t xml:space="preserve">[CONFIRM ranking against the 2023 joint malnutrition estimates]</w:t>
-      </w:r>
-      <w:r>
-        <w:t xml:space="preserve">, and</w:t>
-      </w:r>
-      <w:r>
-        <w:t xml:space="preserve"> </w:t>
-      </w:r>
-      <w:r>
-        <w:t xml:space="preserve">regional prevalence ranges from about 22% to 52% [6].</w:t>
+        <w:t xml:space="preserve">Development Goals [5]. In Madagascar, 40% of children under 5 are stunted [6], nearly twice the</w:t>
+      </w:r>
+      <w:r>
+        <w:t xml:space="preserve"> </w:t>
+      </w:r>
+      <w:r>
+        <w:t xml:space="preserve">global prevalence of 22.3% [3], and regional prevalence ranges from about 22% to 52% [6].</w:t>
       </w:r>
     </w:p>
     <w:p>
@@ -718,31 +699,13 @@
         <w:t xml:space="preserve"> </w:t>
       </w:r>
       <w:r>
-        <w:t xml:space="preserve">143 days [6].</w:t>
-      </w:r>
-      <w:r>
-        <w:t xml:space="preserve"> </w:t>
-      </w:r>
-      <w:r>
-        <w:rPr>
-          <w:b/>
-          <w:bCs/>
-        </w:rPr>
-        <w:t xml:space="preserve">[CONFIRM whether data from the 56 clusters completed in March 2020 are included in the</w:t>
-      </w:r>
-      <w:r>
-        <w:rPr>
-          <w:b/>
-          <w:bCs/>
-        </w:rPr>
-        <w:t xml:space="preserve"> </w:t>
-      </w:r>
-      <w:r>
-        <w:rPr>
-          <w:b/>
-          <w:bCs/>
-        </w:rPr>
-        <w:t xml:space="preserve">released file and whether this needs mention.]</w:t>
+        <w:t xml:space="preserve">143 days [6]. All 650 clusters in the released dataset were interviewed between March and July 2021:</w:t>
+      </w:r>
+      <w:r>
+        <w:t xml:space="preserve"> </w:t>
+      </w:r>
+      <w:r>
+        <w:t xml:space="preserve">the 56 clusters completed before the 2020 suspension are not part of it.</w:t>
       </w:r>
     </w:p>
     <w:bookmarkEnd w:id="11"/>
@@ -1967,14 +1930,7 @@
         <w:t xml:space="preserve"> </w:t>
       </w:r>
       <w:r>
-        <w:rPr>
-          <w:b/>
-          <w:bCs/>
-        </w:rPr>
-        <w:t xml:space="preserve">[CONFIRM repository URL]</w:t>
-      </w:r>
-      <w:r>
-        <w:t xml:space="preserve">; the DHS microdata are available from The DHS Program on registration and</w:t>
+        <w:t xml:space="preserve">https://github.com/valofils/missing-data-methods-madagascar-dhs; the DHS microdata are available from The DHS Program on registration and</w:t>
       </w:r>
       <w:r>
         <w:t xml:space="preserve"> </w:t>
@@ -2280,20 +2236,7 @@
         <w:t xml:space="preserve"> </w:t>
       </w:r>
       <w:r>
-        <w:t xml:space="preserve">Chains for both MI methods mixed well (Additional file 1</w:t>
-      </w:r>
-      <w:r>
-        <w:t xml:space="preserve"> </w:t>
-      </w:r>
-      <w:r>
-        <w:rPr>
-          <w:b/>
-          <w:bCs/>
-        </w:rPr>
-        <w:t xml:space="preserve">[CONFIRM numbering]</w:t>
-      </w:r>
-      <w:r>
-        <w:t xml:space="preserve">).</w:t>
+        <w:t xml:space="preserve">Chains for both MI methods mixed well.</w:t>
       </w:r>
     </w:p>
     <w:p>
@@ -3301,13 +3244,13 @@
         <w:t xml:space="preserve"> </w:t>
       </w:r>
       <w:r>
-        <w:t xml:space="preserve">forms of multiple imputation differed from complete-case estimates by a few hundredths of a</w:t>
-      </w:r>
-      <w:r>
-        <w:t xml:space="preserve"> </w:t>
-      </w:r>
-      <w:r>
-        <w:t xml:space="preserve">percentage point, and CIs were practically identical. Subgroup estimates moved more, by up to</w:t>
+        <w:t xml:space="preserve">forms of multiple imputation differed from complete-case estimates by no more than 0.03 percentage</w:t>
+      </w:r>
+      <w:r>
+        <w:t xml:space="preserve"> </w:t>
+      </w:r>
+      <w:r>
+        <w:t xml:space="preserve">points, and CIs were practically identical. Subgroup estimates moved more, by up to</w:t>
       </w:r>
       <w:r>
         <w:t xml:space="preserve"> </w:t>
@@ -4225,13 +4168,13 @@
         <w:t xml:space="preserve"> </w:t>
       </w:r>
       <w:r>
-        <w:t xml:space="preserve">quantify the Monte Carlo error of MI point estimates, so differences of a few hundredths of a</w:t>
-      </w:r>
-      <w:r>
-        <w:t xml:space="preserve"> </w:t>
-      </w:r>
-      <w:r>
-        <w:t xml:space="preserve">percentage point between methods should not be interpreted.</w:t>
+        <w:t xml:space="preserve">quantify the Monte Carlo error of MI point estimates, so differences between methods smaller than</w:t>
+      </w:r>
+      <w:r>
+        <w:t xml:space="preserve"> </w:t>
+      </w:r>
+      <w:r>
+        <w:t xml:space="preserve">about 0.05 percentage points should not be interpreted.</w:t>
       </w:r>
     </w:p>
     <w:p>
@@ -4424,29 +4367,19 @@
         <w:t xml:space="preserve"> </w:t>
       </w:r>
       <w:r>
-        <w:t xml:space="preserve">ethics committee, and informed consent was obtained before biomarker measurement [6].</w:t>
-      </w:r>
-      <w:r>
-        <w:t xml:space="preserve"> </w:t>
-      </w:r>
-      <w:r>
-        <w:rPr>
-          <w:b/>
-          <w:bCs/>
-        </w:rPr>
-        <w:t xml:space="preserve">[CONFIRM wording against DHS standard consent procedures and journal requirements.]</w:t>
-      </w:r>
-      <w:r>
-        <w:t xml:space="preserve"> </w:t>
-      </w:r>
-      <w:r>
-        <w:t xml:space="preserve">Data were</w:t>
-      </w:r>
-      <w:r>
-        <w:t xml:space="preserve"> </w:t>
-      </w:r>
-      <w:r>
-        <w:t xml:space="preserve">obtained from The DHS Program under its terms of use.</w:t>
+        <w:t xml:space="preserve">ethics committee, and informed consent was obtained before biomarker measurement, as described in the</w:t>
+      </w:r>
+      <w:r>
+        <w:t xml:space="preserve"> </w:t>
+      </w:r>
+      <w:r>
+        <w:t xml:space="preserve">survey report [6]. Data were obtained from The DHS Program under its terms of use. The present</w:t>
+      </w:r>
+      <w:r>
+        <w:t xml:space="preserve"> </w:t>
+      </w:r>
+      <w:r>
+        <w:t xml:space="preserve">analysis used anonymised data and required no additional ethical approval.</w:t>
       </w:r>
     </w:p>
     <w:bookmarkEnd w:id="32"/>

</xml_diff>